<commit_message>
Guarantee every table fits on one page; save note form rules
Rows keep with the next row and never split, the builder checks each
page's total height against the usable area, adjacent tables on page 1
are separated or merged so Word does not join them, the header no longer
pushes body text, and render_check.py flags any clipped cell text.
CLAUDE.md records the fixed note form for future sessions.

Co-Authored-By: Claude Opus 5.5 <noreply@anthropic.com>
Claude-Session: https://claude.ai/code/session_01UJbCptYb6Yf7HukYBovQSt
</commit_message>
<xml_diff>
--- a/output/PQ4R_탄성력_교과서_편집용.docx
+++ b/output/PQ4R_탄성력_교과서_편집용.docx
@@ -155,6 +155,16 @@
         </w:tc>
       </w:tr>
     </w:tbl>
+    <w:p>
+      <w:pPr>
+        <w:spacing w:before="0" w:after="0" w:line="28" w:lineRule="exact"/>
+      </w:pPr>
+      <w:r>
+        <w:rPr>
+          <w:sz w:val="2"/>
+        </w:rPr>
+      </w:r>
+    </w:p>
     <w:tbl>
       <w:tblPr>
         <w:jc w:val="center"/>
@@ -168,7 +178,7 @@
       </w:tblGrid>
       <w:tr>
         <w:trPr>
-          <w:trHeight w:val="510" w:hRule="exact"/>
+          <w:trHeight w:val="482" w:hRule="exact"/>
           <w:cantSplit/>
         </w:trPr>
         <w:tc>
@@ -438,7 +448,7 @@
       </w:tblGrid>
       <w:tr>
         <w:trPr>
-          <w:trHeight w:val="1814" w:hRule="exact"/>
+          <w:trHeight w:val="1928" w:hRule="exact"/>
           <w:cantSplit/>
         </w:trPr>
         <w:tc>
@@ -457,11 +467,12 @@
               <w:right w:val="single" w:sz="12" w:color="0E7FCC"/>
             </w:tcBorders>
             <w:shd w:val="clear" w:color="auto" w:fill="E0F1FA"/>
-            <w:vAlign w:val="center"/>
+            <w:vAlign w:val="top"/>
           </w:tcPr>
           <w:p>
             <w:pPr>
-              <w:spacing w:before="0" w:after="0" w:line="312" w:lineRule="auto"/>
+              <w:keepNext/>
+              <w:spacing w:before="0" w:after="0" w:line="300" w:lineRule="auto"/>
               <w:jc w:val="left"/>
             </w:pPr>
             <w:r>
@@ -476,7 +487,7 @@
           </w:p>
           <w:p>
             <w:pPr>
-              <w:spacing w:before="0" w:after="0" w:line="312" w:lineRule="auto"/>
+              <w:spacing w:before="0" w:after="0" w:line="300" w:lineRule="auto"/>
               <w:jc w:val="left"/>
             </w:pPr>
             <w:r>
@@ -491,7 +502,7 @@
           </w:p>
           <w:p>
             <w:pPr>
-              <w:spacing w:before="0" w:after="0" w:line="312" w:lineRule="auto"/>
+              <w:spacing w:before="0" w:after="0" w:line="300" w:lineRule="auto"/>
               <w:jc w:val="left"/>
             </w:pPr>
             <w:r>
@@ -506,7 +517,7 @@
           </w:p>
           <w:p>
             <w:pPr>
-              <w:spacing w:before="0" w:after="0" w:line="312" w:lineRule="auto"/>
+              <w:spacing w:before="0" w:after="0" w:line="300" w:lineRule="auto"/>
               <w:jc w:val="left"/>
             </w:pPr>
             <w:r>
@@ -521,21 +532,9 @@
           </w:p>
         </w:tc>
       </w:tr>
-    </w:tbl>
-    <w:tbl>
-      <w:tblPr>
-        <w:jc w:val="center"/>
-        <w:tblLayout w:type="fixed"/>
-        <w:tblLook w:firstColumn="1" w:firstRow="1" w:lastColumn="0" w:lastRow="0" w:noHBand="0" w:noVBand="1" w:val="04A0"/>
-        <w:tblLayout w:type="fixed"/>
-        <w:tblW w:w="10546" w:type="dxa"/>
-      </w:tblPr>
-      <w:tblGrid>
-        <w:gridCol w:w="10545"/>
-      </w:tblGrid>
       <w:tr>
         <w:trPr>
-          <w:trHeight w:val="2339" w:hRule="exact"/>
+          <w:trHeight w:val="2310" w:hRule="exact"/>
           <w:cantSplit/>
         </w:trPr>
         <w:tc>
@@ -557,6 +556,7 @@
           </w:tcPr>
           <w:p>
             <w:pPr>
+              <w:keepNext/>
               <w:spacing w:before="0" w:after="0" w:line="288" w:lineRule="auto"/>
               <w:jc w:val="left"/>
             </w:pPr>
@@ -574,7 +574,7 @@
       </w:tr>
       <w:tr>
         <w:trPr>
-          <w:trHeight w:val="2339" w:hRule="exact"/>
+          <w:trHeight w:val="2310" w:hRule="exact"/>
           <w:cantSplit/>
         </w:trPr>
         <w:tc>
@@ -596,6 +596,7 @@
           </w:tcPr>
           <w:p>
             <w:pPr>
+              <w:keepNext/>
               <w:spacing w:before="0" w:after="0" w:line="288" w:lineRule="auto"/>
               <w:jc w:val="left"/>
             </w:pPr>
@@ -613,7 +614,7 @@
       </w:tr>
       <w:tr>
         <w:trPr>
-          <w:trHeight w:val="2339" w:hRule="exact"/>
+          <w:trHeight w:val="2310" w:hRule="exact"/>
           <w:cantSplit/>
         </w:trPr>
         <w:tc>
@@ -635,6 +636,7 @@
           </w:tcPr>
           <w:p>
             <w:pPr>
+              <w:keepNext/>
               <w:spacing w:before="0" w:after="0" w:line="288" w:lineRule="auto"/>
               <w:jc w:val="left"/>
             </w:pPr>
@@ -652,7 +654,7 @@
       </w:tr>
       <w:tr>
         <w:trPr>
-          <w:trHeight w:val="2339" w:hRule="exact"/>
+          <w:trHeight w:val="2310" w:hRule="exact"/>
           <w:cantSplit/>
         </w:trPr>
         <w:tc>
@@ -990,6 +992,7 @@
           </w:tcPr>
           <w:p>
             <w:pPr>
+              <w:keepNext/>
               <w:spacing w:before="0" w:after="0" w:line="288" w:lineRule="auto"/>
               <w:jc w:val="center"/>
             </w:pPr>
@@ -1024,6 +1027,7 @@
           </w:tcPr>
           <w:p>
             <w:pPr>
+              <w:keepNext/>
               <w:spacing w:before="0" w:after="0" w:line="288" w:lineRule="auto"/>
               <w:jc w:val="center"/>
             </w:pPr>
@@ -1058,6 +1062,7 @@
           </w:tcPr>
           <w:p>
             <w:pPr>
+              <w:keepNext/>
               <w:spacing w:before="0" w:after="0" w:line="288" w:lineRule="auto"/>
               <w:jc w:val="center"/>
             </w:pPr>
@@ -1097,6 +1102,7 @@
           </w:tcPr>
           <w:p>
             <w:pPr>
+              <w:keepNext/>
               <w:spacing w:before="0" w:after="0" w:line="288" w:lineRule="auto"/>
               <w:jc w:val="center"/>
             </w:pPr>
@@ -1130,6 +1136,7 @@
           </w:tcPr>
           <w:p>
             <w:pPr>
+              <w:keepNext/>
               <w:spacing w:before="0" w:after="0" w:line="324" w:lineRule="auto"/>
               <w:jc w:val="center"/>
             </w:pPr>
@@ -1160,7 +1167,11 @@
               <w:right w:val="single" w:sz="12" w:color="FF9F28"/>
             </w:tcBorders>
           </w:tcPr>
-          <w:p/>
+          <w:p>
+            <w:pPr>
+              <w:keepNext/>
+            </w:pPr>
+          </w:p>
         </w:tc>
       </w:tr>
       <w:tr>
@@ -1187,6 +1198,7 @@
           </w:tcPr>
           <w:p>
             <w:pPr>
+              <w:keepNext/>
               <w:spacing w:before="0" w:after="0" w:line="288" w:lineRule="auto"/>
               <w:jc w:val="center"/>
             </w:pPr>
@@ -1220,6 +1232,7 @@
           </w:tcPr>
           <w:p>
             <w:pPr>
+              <w:keepNext/>
               <w:spacing w:before="0" w:after="0" w:line="324" w:lineRule="auto"/>
               <w:jc w:val="center"/>
             </w:pPr>
@@ -1250,7 +1263,11 @@
               <w:right w:val="single" w:sz="12" w:color="FF9F28"/>
             </w:tcBorders>
           </w:tcPr>
-          <w:p/>
+          <w:p>
+            <w:pPr>
+              <w:keepNext/>
+            </w:pPr>
+          </w:p>
         </w:tc>
       </w:tr>
       <w:tr>
@@ -1643,6 +1660,7 @@
           </w:tcPr>
           <w:p>
             <w:pPr>
+              <w:keepNext/>
               <w:spacing w:before="0" w:after="0" w:line="288" w:lineRule="auto"/>
               <w:jc w:val="center"/>
             </w:pPr>
@@ -1677,6 +1695,7 @@
           </w:tcPr>
           <w:p>
             <w:pPr>
+              <w:keepNext/>
               <w:spacing w:before="0" w:after="0" w:line="288" w:lineRule="auto"/>
               <w:jc w:val="center"/>
             </w:pPr>
@@ -1716,6 +1735,7 @@
           </w:tcPr>
           <w:p>
             <w:pPr>
+              <w:keepNext/>
               <w:spacing w:before="0" w:after="0" w:line="288" w:lineRule="auto"/>
               <w:jc w:val="center"/>
             </w:pPr>
@@ -1746,7 +1766,11 @@
               <w:right w:val="single" w:sz="12" w:color="68A941"/>
             </w:tcBorders>
           </w:tcPr>
-          <w:p/>
+          <w:p>
+            <w:pPr>
+              <w:keepNext/>
+            </w:pPr>
+          </w:p>
         </w:tc>
       </w:tr>
       <w:tr>
@@ -1773,6 +1797,7 @@
           </w:tcPr>
           <w:p>
             <w:pPr>
+              <w:keepNext/>
               <w:spacing w:before="0" w:after="0" w:line="288" w:lineRule="auto"/>
               <w:jc w:val="center"/>
             </w:pPr>
@@ -1803,7 +1828,11 @@
               <w:right w:val="single" w:sz="12" w:color="68A941"/>
             </w:tcBorders>
           </w:tcPr>
-          <w:p/>
+          <w:p>
+            <w:pPr>
+              <w:keepNext/>
+            </w:pPr>
+          </w:p>
         </w:tc>
       </w:tr>
       <w:tr>
@@ -1830,6 +1859,7 @@
           </w:tcPr>
           <w:p>
             <w:pPr>
+              <w:keepNext/>
               <w:spacing w:before="0" w:after="0" w:line="288" w:lineRule="auto"/>
               <w:jc w:val="center"/>
             </w:pPr>
@@ -1860,7 +1890,11 @@
               <w:right w:val="single" w:sz="12" w:color="68A941"/>
             </w:tcBorders>
           </w:tcPr>
-          <w:p/>
+          <w:p>
+            <w:pPr>
+              <w:keepNext/>
+            </w:pPr>
+          </w:p>
         </w:tc>
       </w:tr>
       <w:tr>
@@ -2220,6 +2254,7 @@
           </w:tcPr>
           <w:p>
             <w:pPr>
+              <w:keepNext/>
               <w:spacing w:before="0" w:after="0" w:line="288" w:lineRule="auto"/>
               <w:jc w:val="center"/>
             </w:pPr>
@@ -2254,6 +2289,7 @@
           </w:tcPr>
           <w:p>
             <w:pPr>
+              <w:keepNext/>
               <w:spacing w:before="0" w:after="0" w:line="288" w:lineRule="auto"/>
               <w:jc w:val="center"/>
             </w:pPr>
@@ -2293,6 +2329,7 @@
           </w:tcPr>
           <w:p>
             <w:pPr>
+              <w:keepNext/>
               <w:spacing w:before="0" w:after="0" w:line="324" w:lineRule="auto"/>
               <w:jc w:val="center"/>
             </w:pPr>
@@ -2338,7 +2375,11 @@
               <w:right w:val="single" w:sz="12" w:color="FF8A68"/>
             </w:tcBorders>
           </w:tcPr>
-          <w:p/>
+          <w:p>
+            <w:pPr>
+              <w:keepNext/>
+            </w:pPr>
+          </w:p>
         </w:tc>
       </w:tr>
       <w:tr>
@@ -2365,6 +2406,7 @@
           </w:tcPr>
           <w:p>
             <w:pPr>
+              <w:keepNext/>
               <w:spacing w:before="0" w:after="0" w:line="324" w:lineRule="auto"/>
               <w:jc w:val="center"/>
             </w:pPr>
@@ -2410,7 +2452,11 @@
               <w:right w:val="single" w:sz="12" w:color="FF8A68"/>
             </w:tcBorders>
           </w:tcPr>
-          <w:p/>
+          <w:p>
+            <w:pPr>
+              <w:keepNext/>
+            </w:pPr>
+          </w:p>
         </w:tc>
       </w:tr>
       <w:tr>
@@ -2437,6 +2483,7 @@
           </w:tcPr>
           <w:p>
             <w:pPr>
+              <w:keepNext/>
               <w:spacing w:before="0" w:after="0" w:line="324" w:lineRule="auto"/>
               <w:jc w:val="center"/>
             </w:pPr>
@@ -2482,7 +2529,11 @@
               <w:right w:val="single" w:sz="12" w:color="FF8A68"/>
             </w:tcBorders>
           </w:tcPr>
-          <w:p/>
+          <w:p>
+            <w:pPr>
+              <w:keepNext/>
+            </w:pPr>
+          </w:p>
         </w:tc>
       </w:tr>
       <w:tr>
@@ -2857,6 +2908,7 @@
           </w:tcPr>
           <w:p>
             <w:pPr>
+              <w:keepNext/>
               <w:spacing w:before="0" w:after="0" w:line="288" w:lineRule="auto"/>
               <w:jc w:val="center"/>
             </w:pPr>
@@ -2891,6 +2943,7 @@
           </w:tcPr>
           <w:p>
             <w:pPr>
+              <w:keepNext/>
               <w:spacing w:before="0" w:after="0" w:line="288" w:lineRule="auto"/>
               <w:jc w:val="center"/>
             </w:pPr>
@@ -2930,6 +2983,7 @@
           </w:tcPr>
           <w:p>
             <w:pPr>
+              <w:keepNext/>
               <w:spacing w:before="0" w:after="0" w:line="324" w:lineRule="auto"/>
               <w:jc w:val="center"/>
             </w:pPr>
@@ -2978,7 +3032,11 @@
               <w:right w:val="single" w:sz="12" w:color="6C2596"/>
             </w:tcBorders>
           </w:tcPr>
-          <w:p/>
+          <w:p>
+            <w:pPr>
+              <w:keepNext/>
+            </w:pPr>
+          </w:p>
         </w:tc>
       </w:tr>
       <w:tr>
@@ -3005,6 +3063,7 @@
           </w:tcPr>
           <w:p>
             <w:pPr>
+              <w:keepNext/>
               <w:spacing w:before="0" w:after="0" w:line="324" w:lineRule="auto"/>
               <w:jc w:val="center"/>
             </w:pPr>
@@ -3053,7 +3112,11 @@
               <w:right w:val="single" w:sz="12" w:color="6C2596"/>
             </w:tcBorders>
           </w:tcPr>
-          <w:p/>
+          <w:p>
+            <w:pPr>
+              <w:keepNext/>
+            </w:pPr>
+          </w:p>
         </w:tc>
       </w:tr>
       <w:tr>
@@ -3352,7 +3415,7 @@
   <w:p>
     <w:pPr>
       <w:pStyle w:val="Header"/>
-      <w:spacing w:before="0" w:after="0" w:line="240" w:lineRule="auto"/>
+      <w:spacing w:before="0" w:after="0" w:line="20" w:lineRule="exact"/>
       <w:jc w:val="left"/>
     </w:pPr>
     <w:r>

</xml_diff>